<commit_message>
Cobrador de Mora (opcion B): ZONA de la base cruza vs No. de Cobrador (col I)
Por definicion del usuario, la ZONA de la base maestra se cruza directamente
contra la columna 'No. de Cobrador' (columna I / ID_COBRADOR) de
ZONAS_ASIGNADAS; de esa fila se traen REGION/DIVISION/RUTA. El ID_COBRADOR de
Mora es el valor de la columna I que coincidio con la ZONA. Inactivas siguen
tomando el IdCobrador de la cartera. Documento y spec actualizados.

Co-Authored-By: Claude Opus 4.8 <noreply@anthropic.com>
Claude-Session: https://claude.ai/code/session_01NaEoQRP5SjU8EPcaa6vWhD
</commit_message>
<xml_diff>
--- a/docs/Especificacion_Base_Maestra.docx
+++ b/docs/Especificacion_Base_Maestra.docx
@@ -724,7 +724,7 @@
               <w:rPr>
                 <w:sz w:val="19"/>
               </w:rPr>
-              <w:t>JOIN ZONA=ZONA. Trae REGION/DIVISION/RUTA e ID_COBRADOR (No. de Cobrador, distinto de ZONA)</w:t>
+              <w:t>JOIN: la ZONA de la base (col C) = No. de Cobrador (columna I) de ZONAS. Trae REGION/DIVISION/RUTA</w:t>
             </w:r>
           </w:p>
         </w:tc>
@@ -1257,7 +1257,7 @@
               <w:rPr>
                 <w:sz w:val="19"/>
               </w:rPr>
-              <w:t>ID_COBRADOR (No. de Cobrador) de ZONAS_ASIGNADAS, cruzado por ZONA</w:t>
+              <w:t>Se cruza la ZONA de la base contra el No. de Cobrador (columna I) de ZONAS_ASIGNADAS</w:t>
             </w:r>
           </w:p>
         </w:tc>

</xml_diff>

<commit_message>
Cobrador: ZONA(base)=ZONA(col A) de ZONAS y se coloca No. de Cobrador (col I)
Las imagenes del usuario confirman el cruce: la ZONA de la base se compara con
la ZONA (columna A) de ZONAS_ASIGNADAS y se coloca el No. de Cobrador (columna I)
como ID_COBRADOR, que es un valor distinto de la ZONA. Se revierte al cruce
ZONA=ZONA (validado con sus valores: 152->2887, 344->2888). Doc y spec al dia.

Co-Authored-By: Claude Opus 4.8 <noreply@anthropic.com>
Claude-Session: https://claude.ai/code/session_01NaEoQRP5SjU8EPcaa6vWhD
</commit_message>
<xml_diff>
--- a/docs/Especificacion_Base_Maestra.docx
+++ b/docs/Especificacion_Base_Maestra.docx
@@ -724,7 +724,7 @@
               <w:rPr>
                 <w:sz w:val="19"/>
               </w:rPr>
-              <w:t>JOIN: la ZONA de la base (col C) = No. de Cobrador (columna I) de ZONAS. Trae REGION/DIVISION/RUTA</w:t>
+              <w:t>JOIN: ZONA (base) = ZONA (col A) de ZONAS. Se coloca el No. de Cobrador (col I) como ID_COBRADOR; trae REGION/DIVISION/RUTA</w:t>
             </w:r>
           </w:p>
         </w:tc>
@@ -1257,7 +1257,7 @@
               <w:rPr>
                 <w:sz w:val="19"/>
               </w:rPr>
-              <w:t>Se cruza la ZONA de la base contra el No. de Cobrador (columna I) de ZONAS_ASIGNADAS</w:t>
+              <w:t>Cruce ZONA (base) = ZONA (col A) de ZONAS_ASIGNADAS; se coloca el No. de Cobrador (col I)</w:t>
             </w:r>
           </w:p>
         </w:tc>

</xml_diff>